<commit_message>
СВОЁ ДЕЛО 5부 6화: рename Sukhova (Галина Олеговна) to avoid clash with Kirill's mother
Co-Authored-By: Claude Opus 5.5 <noreply@anthropic.com>
Claude-Session: https://claude.ai/code/session_01N4vhCLeYxrjvGnDxQBD9Cq
</commit_message>
<xml_diff>
--- a/svoyo-delo/대본/5부/06화_Ekaterinburg.docx
+++ b/svoyo-delo/대본/5부/06화_Ekaterinburg.docx
@@ -45,7 +45,7 @@
           <w:bCs/>
           <w:b/>
         </w:rPr>
-        <w:t xml:space="preserve">수호바(나탈리야 이고레브나, 작년 코르닐로바 시험 두 번째 통과 — «На Урале колют крепко. Колите мягче»)</w:t>
+        <w:t xml:space="preserve">수호바(갈리나 올레고브나, 작년 코르닐로바 시험 두 번째 통과 — «На Урале колют крепко. Колите мягче»)</w:t>
       </w:r>
       <w:r>
         <w:t xml:space="preserve">의 한 단어 소개</w:t>
@@ -469,7 +469,7 @@
         <w:t xml:space="preserve"> </w:t>
       </w:r>
       <w:r>
-        <w:t xml:space="preserve">- 등장인물: Алексей Воронцов, Ирина Белова, Дмитрий Ковалёв, Наталья Игоревна Сухова(예카테린부르크 피부과 의사, 신규), Виктор Павлович Шершнёв(«УралФармСнаб», 신규), Анатолий Фёдорович Заводчиков(«Каменный пояс», 63, 신규), Полина Андреевна Ракитина(«Исеть Медикал», 32, 신규, 전화), Ольга Миронова(스피커폰)</w:t>
+        <w:t xml:space="preserve">- 등장인물: Алексей Воронцов, Ирина Белова, Дмитрий Ковалёв, Галина Олеговна Сухова(예카테린부르크 피부과 의사, 신규), Виктор Павлович Шершнёв(«УралФармСнаб», 신규), Анатолий Фёдорович Заводчиков(«Каменный пояс», 63, 신규), Полина Андреевна Ракитина(«Исеть Медикал», 32, 신규, 전화), Ольга Миронова(스피커폰)</w:t>
       </w:r>
       <w:r>
         <w:t xml:space="preserve"> </w:t>
@@ -1273,7 +1273,7 @@
         <w:pStyle w:val="BodyText"/>
       </w:pPr>
       <w:r>
-        <w:t xml:space="preserve">ALEKSEY: Наталья Игоревна. Спасибо, что встретили. В Москве было минус пять. Мы думали, это зима.</w:t>
+        <w:t xml:space="preserve">ALEKSEY: Галина Олеговна. Спасибо, что встретили. В Москве было минус пять. Мы думали, это зима.</w:t>
       </w:r>
     </w:p>
     <w:p>
@@ -1297,7 +1297,7 @@
         <w:pStyle w:val="BodyText"/>
       </w:pPr>
       <w:r>
-        <w:t xml:space="preserve">IRINA: Наталья Игоревна, у нас три встречи. Три дистрибьютора. Два дня. Вы их знаете?</w:t>
+        <w:t xml:space="preserve">IRINA: Галина Олеговна, у нас три встречи. Три дистрибьютора. Два дня. Вы их знаете?</w:t>
       </w:r>
     </w:p>
     <w:p>
@@ -1361,7 +1361,7 @@
         <w:pStyle w:val="BodyText"/>
       </w:pPr>
       <w:r>
-        <w:t xml:space="preserve">ALEKSEY: Наталья Игоревна, вы сдавали экзамен у Корниловой. В прошлом году. Со второй попытки.</w:t>
+        <w:t xml:space="preserve">ALEKSEY: Галина Олеговна, вы сдавали экзамен у Корниловой. В прошлом году. Со второй попытки.</w:t>
       </w:r>
     </w:p>
     <w:p>
@@ -1539,7 +1539,7 @@
         <w:pStyle w:val="BodyText"/>
       </w:pPr>
       <w:r>
-        <w:t xml:space="preserve">SHERSHNYOV: Наталья Игоревна, вы у них в доле, что ли? Вы же наша, уральская.</w:t>
+        <w:t xml:space="preserve">SHERSHNYOV: Галина Олеговна, вы у них в доле, что ли? Вы же наша, уральская.</w:t>
       </w:r>
     </w:p>
     <w:p>
@@ -1773,7 +1773,7 @@
         <w:pStyle w:val="BodyText"/>
       </w:pPr>
       <w:r>
-        <w:t xml:space="preserve">ZAVODCHIKOV: Знаю. Наталья Игоревна рассказала. Вы поделили пополам с казанским. Это правильно. Я бы тоже поделил.</w:t>
+        <w:t xml:space="preserve">ZAVODCHIKOV: Знаю. Галина Олеговна рассказала. Вы поделили пополам с казанским. Это правильно. Я бы тоже поделил.</w:t>
       </w:r>
     </w:p>
     <w:p>
@@ -1877,7 +1877,7 @@
         <w:pStyle w:val="BodyText"/>
       </w:pPr>
       <w:r>
-        <w:t xml:space="preserve">DIMA: Тренер может быть Наталья Игоревна. Она сдала экзамен.</w:t>
+        <w:t xml:space="preserve">DIMA: Тренер может быть Галина Олеговна. Она сдала экзамен.</w:t>
       </w:r>
     </w:p>
     <w:p>
@@ -2209,7 +2209,7 @@
         <w:pStyle w:val="BodyText"/>
       </w:pPr>
       <w:r>
-        <w:t xml:space="preserve">ZAVODCHIKOV: Внучка. Шестнадцать лет. Шрамы после акне. Не ходит на школьные вечера, сидит дома в капюшоне. Я думал — баловство, пройдёт. Не прошло. Наталья Игоревна посмотрит её первой. Не из-за скидки. Из-за журнала. Своего ребёнка я отдам только туда, где ведут журнал.</w:t>
+        <w:t xml:space="preserve">ZAVODCHIKOV: Внучка. Шестнадцать лет. Шрамы после акне. Не ходит на школьные вечера, сидит дома в капюшоне. Я думал — баловство, пройдёт. Не прошло. Галина Олеговна посмотрит её первой. Не из-за скидки. Из-за журнала. Своего ребёнка я отдам только туда, где ведут журнал.</w:t>
       </w:r>
     </w:p>
     <w:p>
@@ -4253,7 +4253,7 @@
         <w:pStyle w:val="BodyText"/>
       </w:pPr>
       <w:r>
-        <w:t xml:space="preserve">알렉세이: 나탈리야 이고레브나. 마중 나와 줘서 고마워요. 모스크바는 영하 5도였어요. 그게 겨울인 줄 알았죠.</w:t>
+        <w:t xml:space="preserve">알렉세이: 갈리나 올레고브나. 마중 나와 줘서 고마워요. 모스크바는 영하 5도였어요. 그게 겨울인 줄 알았죠.</w:t>
       </w:r>
     </w:p>
     <w:p>
@@ -4277,7 +4277,7 @@
         <w:pStyle w:val="BodyText"/>
       </w:pPr>
       <w:r>
-        <w:t xml:space="preserve">이리나: 나탈리야 이고레브나, 미팅이 셋이에요. 유통사 셋. 이틀. 다 아세요?</w:t>
+        <w:t xml:space="preserve">이리나: 갈리나 올레고브나, 미팅이 셋이에요. 유통사 셋. 이틀. 다 아세요?</w:t>
       </w:r>
     </w:p>
     <w:p>
@@ -4341,7 +4341,7 @@
         <w:pStyle w:val="BodyText"/>
       </w:pPr>
       <w:r>
-        <w:t xml:space="preserve">알렉세이: 나탈리야 이고레브나, 작년에 코르닐로바 시험을 보셨죠. 두 번째에 통과.</w:t>
+        <w:t xml:space="preserve">알렉세이: 갈리나 올레고브나, 작년에 코르닐로바 시험을 보셨죠. 두 번째에 통과.</w:t>
       </w:r>
     </w:p>
     <w:p>
@@ -4519,7 +4519,7 @@
         <w:pStyle w:val="BodyText"/>
       </w:pPr>
       <w:r>
-        <w:t xml:space="preserve">셰르시뇨프: 나탈리야 이고레브나, 저쪽이랑 지분이라도 있어요? 우리 우랄 사람이잖아요.</w:t>
+        <w:t xml:space="preserve">셰르시뇨프: 갈리나 올레고브나, 저쪽이랑 지분이라도 있어요? 우리 우랄 사람이잖아요.</w:t>
       </w:r>
     </w:p>
     <w:p>
@@ -4753,7 +4753,7 @@
         <w:pStyle w:val="BodyText"/>
       </w:pPr>
       <w:r>
-        <w:t xml:space="preserve">자보드치코프: 알아요. 나탈리야 이고레브나가 얘기했어요. 카잔 사람이랑 반반 나눴다고. 옳은 일이에요. 나라도 나눴을 거예요.</w:t>
+        <w:t xml:space="preserve">자보드치코프: 알아요. 갈리나 올레고브나가 얘기했어요. 카잔 사람이랑 반반 나눴다고. 옳은 일이에요. 나라도 나눴을 거예요.</w:t>
       </w:r>
     </w:p>
     <w:p>
@@ -4857,7 +4857,7 @@
         <w:pStyle w:val="BodyText"/>
       </w:pPr>
       <w:r>
-        <w:t xml:space="preserve">디마: 강사는 나탈리야 이고레브나가 할 수 있어요. 시험을 통과했어요.</w:t>
+        <w:t xml:space="preserve">디마: 강사는 갈리나 올레고브나가 할 수 있어요. 시험을 통과했어요.</w:t>
       </w:r>
     </w:p>
     <w:p>
@@ -5189,7 +5189,7 @@
         <w:pStyle w:val="BodyText"/>
       </w:pPr>
       <w:r>
-        <w:t xml:space="preserve">자보드치코프: 손녀. 열여섯. 여드름 흉터. 학교 파티에 안 가요, 후드 쓰고 집에만 있어요. 사치라고, 지나갈 거라고 생각했어요. 안 지나갔어요. 나탈리야 이고레브나가 그 애를 제일 먼저 봐 줄 거예요. 할인 때문이 아니에요. 일지 때문이에요. 내 아이는 일지를 쓰는 곳에만 맡겨요.</w:t>
+        <w:t xml:space="preserve">자보드치코프: 손녀. 열여섯. 여드름 흉터. 학교 파티에 안 가요, 후드 쓰고 집에만 있어요. 사치라고, 지나갈 거라고 생각했어요. 안 지나갔어요. 갈리나 올레고브나가 그 애를 제일 먼저 봐 줄 거예요. 할인 때문이 아니에요. 일지 때문이에요. 내 아이는 일지를 쓰는 곳에만 맡겨요.</w:t>
       </w:r>
     </w:p>
     <w:p>

</xml_diff>